<commit_message>
add mat/cube to jpg
</commit_message>
<xml_diff>
--- a/HSI_Libraries.docx
+++ b/HSI_Libraries.docx
@@ -2,6 +2,334 @@
 <file path=word/document.xml><?xml version="1.0" encoding="utf-8"?>
 <w:document xmlns:wpc="http://schemas.microsoft.com/office/word/2010/wordprocessingCanvas" xmlns:cx="http://schemas.microsoft.com/office/drawing/2014/chartex" xmlns:cx1="http://schemas.microsoft.com/office/drawing/2015/9/8/chartex" xmlns:cx2="http://schemas.microsoft.com/office/drawing/2015/10/21/chartex" xmlns:cx3="http://schemas.microsoft.com/office/drawing/2016/5/9/chartex" xmlns:cx4="http://schemas.microsoft.com/office/drawing/2016/5/10/chartex" xmlns:cx5="http://schemas.microsoft.com/office/drawing/2016/5/11/chartex" xmlns:cx6="http://schemas.microsoft.com/office/drawing/2016/5/12/chartex" xmlns:cx7="http://schemas.microsoft.com/office/drawing/2016/5/13/chartex" xmlns:cx8="http://schemas.microsoft.com/office/drawing/2016/5/14/chartex" xmlns:mc="http://schemas.openxmlformats.org/markup-compatibility/2006" xmlns:aink="http://schemas.microsoft.com/office/drawing/2016/ink" xmlns:am3d="http://schemas.microsoft.com/office/drawing/2017/model3d" xmlns:o="urn:schemas-microsoft-com:office:office" xmlns:oel="http://schemas.microsoft.com/office/2019/extlst" xmlns:r="http://schemas.openxmlformats.org/officeDocument/2006/relationships" xmlns:m="http://schemas.openxmlformats.org/officeDocument/2006/math" xmlns:v="urn:schemas-microsoft-com:vml" xmlns:wp14="http://schemas.microsoft.com/office/word/2010/wordprocessingDrawing" xmlns:wp="http://schemas.openxmlformats.org/drawingml/2006/wordprocessingDrawing" xmlns:w10="urn:schemas-microsoft-com:office:word" xmlns:w="http://schemas.openxmlformats.org/wordprocessingml/2006/main" xmlns:w14="http://schemas.microsoft.com/office/word/2010/wordml" xmlns:w15="http://schemas.microsoft.com/office/word/2012/wordml" xmlns:w16cex="http://schemas.microsoft.com/office/word/2018/wordml/cex" xmlns:w16cid="http://schemas.microsoft.com/office/word/2016/wordml/cid" xmlns:w16="http://schemas.microsoft.com/office/word/2018/wordml" xmlns:w16du="http://schemas.microsoft.com/office/word/2023/wordml/word16du" xmlns:w16sdtdh="http://schemas.microsoft.com/office/word/2020/wordml/sdtdatahash" xmlns:w16sdtfl="http://schemas.microsoft.com/office/word/2024/wordml/sdtformatlock" xmlns:w16se="http://schemas.microsoft.com/office/word/2015/wordml/symex" xmlns:wpg="http://schemas.microsoft.com/office/word/2010/wordprocessingGroup" xmlns:wpi="http://schemas.microsoft.com/office/word/2010/wordprocessingInk" xmlns:wne="http://schemas.microsoft.com/office/word/2006/wordml" xmlns:wps="http://schemas.microsoft.com/office/word/2010/wordprocessingShape" mc:Ignorable="w14 w15 w16se w16cid w16 w16cex w16sdtdh w16sdtfl w16du wp14">
   <w:body>
+    <w:sdt>
+      <w:sdtPr>
+        <w:id w:val="1881283360"/>
+        <w:docPartObj>
+          <w:docPartGallery w:val="Table of Contents"/>
+          <w:docPartUnique/>
+        </w:docPartObj>
+      </w:sdtPr>
+      <w:sdtEndPr>
+        <w:rPr>
+          <w:rFonts w:asciiTheme="minorHAnsi" w:eastAsiaTheme="minorHAnsi" w:hAnsiTheme="minorHAnsi" w:cstheme="minorBidi"/>
+          <w:b/>
+          <w:bCs/>
+          <w:noProof/>
+          <w:color w:val="auto"/>
+          <w:kern w:val="2"/>
+          <w:sz w:val="24"/>
+          <w:szCs w:val="24"/>
+          <w:lang w:val="en-CA"/>
+          <w14:ligatures w14:val="standardContextual"/>
+        </w:rPr>
+      </w:sdtEndPr>
+      <w:sdtContent>
+        <w:p>
+          <w:pPr>
+            <w:pStyle w:val="TOCHeading"/>
+          </w:pPr>
+          <w:r>
+            <w:t>Table of Contents</w:t>
+          </w:r>
+        </w:p>
+        <w:p>
+          <w:pPr>
+            <w:pStyle w:val="TOC1"/>
+            <w:tabs>
+              <w:tab w:val="right" w:leader="dot" w:pos="9350"/>
+            </w:tabs>
+            <w:rPr>
+              <w:noProof/>
+            </w:rPr>
+          </w:pPr>
+          <w:r>
+            <w:fldChar w:fldCharType="begin"/>
+          </w:r>
+          <w:r>
+            <w:instrText xml:space="preserve"> TOC \o "1-3" \h \z \u </w:instrText>
+          </w:r>
+          <w:r>
+            <w:fldChar w:fldCharType="separate"/>
+          </w:r>
+          <w:hyperlink w:anchor="_Toc223906796" w:history="1">
+            <w:r>
+              <w:rPr>
+                <w:rStyle w:val="Hyperlink"/>
+                <w:noProof/>
+                <w:lang w:val="en-US"/>
+              </w:rPr>
+              <w:t>Main_HSI.jpynb</w:t>
+            </w:r>
+            <w:r>
+              <w:rPr>
+                <w:noProof/>
+                <w:webHidden/>
+              </w:rPr>
+              <w:tab/>
+            </w:r>
+            <w:r>
+              <w:rPr>
+                <w:noProof/>
+                <w:webHidden/>
+              </w:rPr>
+              <w:fldChar w:fldCharType="begin"/>
+            </w:r>
+            <w:r>
+              <w:rPr>
+                <w:noProof/>
+                <w:webHidden/>
+              </w:rPr>
+              <w:instrText xml:space="preserve"> PAGEREF _Toc223906796 \h </w:instrText>
+            </w:r>
+            <w:r>
+              <w:rPr>
+                <w:noProof/>
+                <w:webHidden/>
+              </w:rPr>
+            </w:r>
+            <w:r>
+              <w:rPr>
+                <w:noProof/>
+                <w:webHidden/>
+              </w:rPr>
+              <w:fldChar w:fldCharType="separate"/>
+            </w:r>
+            <w:r>
+              <w:rPr>
+                <w:noProof/>
+                <w:webHidden/>
+              </w:rPr>
+              <w:t>2</w:t>
+            </w:r>
+            <w:r>
+              <w:rPr>
+                <w:noProof/>
+                <w:webHidden/>
+              </w:rPr>
+              <w:fldChar w:fldCharType="end"/>
+            </w:r>
+          </w:hyperlink>
+        </w:p>
+        <w:p>
+          <w:pPr>
+            <w:pStyle w:val="TOC2"/>
+            <w:tabs>
+              <w:tab w:val="right" w:leader="dot" w:pos="9350"/>
+            </w:tabs>
+            <w:rPr>
+              <w:noProof/>
+            </w:rPr>
+          </w:pPr>
+          <w:hyperlink w:anchor="_Toc223906797" w:history="1">
+            <w:r>
+              <w:rPr>
+                <w:rStyle w:val="Hyperlink"/>
+                <w:noProof/>
+                <w:lang w:val="en-US"/>
+              </w:rPr>
+              <w:t>HSI.py</w:t>
+            </w:r>
+            <w:r>
+              <w:rPr>
+                <w:noProof/>
+                <w:webHidden/>
+              </w:rPr>
+              <w:tab/>
+            </w:r>
+            <w:r>
+              <w:rPr>
+                <w:noProof/>
+                <w:webHidden/>
+              </w:rPr>
+              <w:fldChar w:fldCharType="begin"/>
+            </w:r>
+            <w:r>
+              <w:rPr>
+                <w:noProof/>
+                <w:webHidden/>
+              </w:rPr>
+              <w:instrText xml:space="preserve"> PAGEREF _Toc223906797 \h </w:instrText>
+            </w:r>
+            <w:r>
+              <w:rPr>
+                <w:noProof/>
+                <w:webHidden/>
+              </w:rPr>
+            </w:r>
+            <w:r>
+              <w:rPr>
+                <w:noProof/>
+                <w:webHidden/>
+              </w:rPr>
+              <w:fldChar w:fldCharType="separate"/>
+            </w:r>
+            <w:r>
+              <w:rPr>
+                <w:noProof/>
+                <w:webHidden/>
+              </w:rPr>
+              <w:t>2</w:t>
+            </w:r>
+            <w:r>
+              <w:rPr>
+                <w:noProof/>
+                <w:webHidden/>
+              </w:rPr>
+              <w:fldChar w:fldCharType="end"/>
+            </w:r>
+          </w:hyperlink>
+        </w:p>
+        <w:p>
+          <w:pPr>
+            <w:pStyle w:val="TOC1"/>
+            <w:tabs>
+              <w:tab w:val="right" w:leader="dot" w:pos="9350"/>
+            </w:tabs>
+            <w:rPr>
+              <w:noProof/>
+            </w:rPr>
+          </w:pPr>
+          <w:hyperlink w:anchor="_Toc223906798" w:history="1">
+            <w:r>
+              <w:rPr>
+                <w:rStyle w:val="Hyperlink"/>
+                <w:noProof/>
+                <w:lang w:val="en-US"/>
+              </w:rPr>
+              <w:t>UAV_Navigation.py</w:t>
+            </w:r>
+            <w:r>
+              <w:rPr>
+                <w:noProof/>
+                <w:webHidden/>
+              </w:rPr>
+              <w:tab/>
+            </w:r>
+            <w:r>
+              <w:rPr>
+                <w:noProof/>
+                <w:webHidden/>
+              </w:rPr>
+              <w:fldChar w:fldCharType="begin"/>
+            </w:r>
+            <w:r>
+              <w:rPr>
+                <w:noProof/>
+                <w:webHidden/>
+              </w:rPr>
+              <w:instrText xml:space="preserve"> PAGEREF _Toc223906798 \h </w:instrText>
+            </w:r>
+            <w:r>
+              <w:rPr>
+                <w:noProof/>
+                <w:webHidden/>
+              </w:rPr>
+            </w:r>
+            <w:r>
+              <w:rPr>
+                <w:noProof/>
+                <w:webHidden/>
+              </w:rPr>
+              <w:fldChar w:fldCharType="separate"/>
+            </w:r>
+            <w:r>
+              <w:rPr>
+                <w:noProof/>
+                <w:webHidden/>
+              </w:rPr>
+              <w:t>5</w:t>
+            </w:r>
+            <w:r>
+              <w:rPr>
+                <w:noProof/>
+                <w:webHidden/>
+              </w:rPr>
+              <w:fldChar w:fldCharType="end"/>
+            </w:r>
+          </w:hyperlink>
+        </w:p>
+        <w:p>
+          <w:pPr>
+            <w:pStyle w:val="TOC1"/>
+            <w:tabs>
+              <w:tab w:val="right" w:leader="dot" w:pos="9350"/>
+            </w:tabs>
+            <w:rPr>
+              <w:noProof/>
+            </w:rPr>
+          </w:pPr>
+          <w:hyperlink w:anchor="_Toc223906799" w:history="1">
+            <w:r>
+              <w:rPr>
+                <w:rStyle w:val="Hyperlink"/>
+                <w:noProof/>
+                <w:lang w:val="en-US"/>
+              </w:rPr>
+              <w:t>Other data</w:t>
+            </w:r>
+            <w:r>
+              <w:rPr>
+                <w:noProof/>
+                <w:webHidden/>
+              </w:rPr>
+              <w:tab/>
+            </w:r>
+            <w:r>
+              <w:rPr>
+                <w:noProof/>
+                <w:webHidden/>
+              </w:rPr>
+              <w:fldChar w:fldCharType="begin"/>
+            </w:r>
+            <w:r>
+              <w:rPr>
+                <w:noProof/>
+                <w:webHidden/>
+              </w:rPr>
+              <w:instrText xml:space="preserve"> PAGEREF _Toc223906799 \h </w:instrText>
+            </w:r>
+            <w:r>
+              <w:rPr>
+                <w:noProof/>
+                <w:webHidden/>
+              </w:rPr>
+            </w:r>
+            <w:r>
+              <w:rPr>
+                <w:noProof/>
+                <w:webHidden/>
+              </w:rPr>
+              <w:fldChar w:fldCharType="separate"/>
+            </w:r>
+            <w:r>
+              <w:rPr>
+                <w:noProof/>
+                <w:webHidden/>
+              </w:rPr>
+              <w:t>6</w:t>
+            </w:r>
+            <w:r>
+              <w:rPr>
+                <w:noProof/>
+                <w:webHidden/>
+              </w:rPr>
+              <w:fldChar w:fldCharType="end"/>
+            </w:r>
+          </w:hyperlink>
+        </w:p>
+        <w:p>
+          <w:r>
+            <w:rPr>
+              <w:b/>
+              <w:bCs/>
+              <w:noProof/>
+            </w:rPr>
+            <w:fldChar w:fldCharType="end"/>
+          </w:r>
+        </w:p>
+      </w:sdtContent>
+    </w:sdt>
     <w:p>
       <w:pPr>
         <w:rPr>
@@ -191,11 +519,12 @@
           <w:lang w:val="en-US"/>
         </w:rPr>
       </w:pPr>
+      <w:bookmarkStart w:id="0" w:name="_Toc223906796"/>
+      <w:proofErr w:type="spellStart"/>
       <w:r>
         <w:rPr>
           <w:lang w:val="en-US"/>
         </w:rPr>
-        <w:lastRenderedPageBreak/>
         <w:t>Main_HSI.</w:t>
       </w:r>
       <w:r>
@@ -216,6 +545,8 @@
         </w:rPr>
         <w:t>nb</w:t>
       </w:r>
+      <w:bookmarkEnd w:id="0"/>
+      <w:proofErr w:type="spellEnd"/>
     </w:p>
     <w:p>
       <w:pPr>
@@ -312,19 +643,73 @@
           <w:lang w:val="en-US"/>
         </w:rPr>
       </w:pPr>
+      <w:bookmarkStart w:id="1" w:name="_Toc223906797"/>
       <w:r>
         <w:rPr>
           <w:lang w:val="en-US"/>
         </w:rPr>
         <w:t>HSI.py</w:t>
       </w:r>
-    </w:p>
-    <w:p>
-      <w:pPr>
-        <w:rPr>
-          <w:lang w:val="en-US"/>
-        </w:rPr>
-      </w:pPr>
+      <w:bookmarkEnd w:id="1"/>
+    </w:p>
+    <w:p>
+      <w:pPr>
+        <w:rPr>
+          <w:lang w:val="en-US"/>
+        </w:rPr>
+      </w:pPr>
+    </w:p>
+    <w:p>
+      <w:pPr>
+        <w:rPr>
+          <w:lang w:val="en-US"/>
+        </w:rPr>
+      </w:pPr>
+    </w:p>
+    <w:p>
+      <w:pPr>
+        <w:rPr>
+          <w:lang w:val="en-US"/>
+        </w:rPr>
+      </w:pPr>
+      <w:r>
+        <w:rPr>
+          <w:lang w:val="en-US"/>
+        </w:rPr>
+        <w:t>Detail</w:t>
+      </w:r>
+      <w:r>
+        <w:rPr>
+          <w:lang w:val="en-US"/>
+        </w:rPr>
+        <w:t>s</w:t>
+      </w:r>
+      <w:r>
+        <w:rPr>
+          <w:lang w:val="en-US"/>
+        </w:rPr>
+        <w:t xml:space="preserve"> </w:t>
+      </w:r>
+      <w:proofErr w:type="gramStart"/>
+      <w:r>
+        <w:rPr>
+          <w:lang w:val="en-US"/>
+        </w:rPr>
+        <w:t xml:space="preserve">of </w:t>
+      </w:r>
+      <w:r>
+        <w:rPr>
+          <w:lang w:val="en-US"/>
+        </w:rPr>
+        <w:t xml:space="preserve"> combine</w:t>
+      </w:r>
+      <w:proofErr w:type="gramEnd"/>
+      <w:r>
+        <w:rPr>
+          <w:lang w:val="en-US"/>
+        </w:rPr>
+        <w:t xml:space="preserve"> Multiple HSI from given data by AAFC Raju</w:t>
+      </w:r>
     </w:p>
     <w:tbl>
       <w:tblPr>
@@ -405,7 +790,13 @@
               <w:rPr>
                 <w:lang w:val="en-US"/>
               </w:rPr>
-              <w:t>Row 1</w:t>
+              <w:t>Scan</w:t>
+            </w:r>
+            <w:r>
+              <w:rPr>
+                <w:lang w:val="en-US"/>
+              </w:rPr>
+              <w:t>1-2</w:t>
             </w:r>
           </w:p>
         </w:tc>
@@ -446,7 +837,7 @@
               <w:rPr>
                 <w:lang w:val="en-US"/>
               </w:rPr>
-              <w:t>Row 2</w:t>
+              <w:t>Scan2-3</w:t>
             </w:r>
           </w:p>
         </w:tc>
@@ -487,7 +878,7 @@
               <w:rPr>
                 <w:lang w:val="en-US"/>
               </w:rPr>
-              <w:t>Row 3</w:t>
+              <w:t>Scan3-4</w:t>
             </w:r>
           </w:p>
         </w:tc>
@@ -528,7 +919,25 @@
               <w:rPr>
                 <w:lang w:val="en-US"/>
               </w:rPr>
-              <w:t>Row 4</w:t>
+              <w:t>Scan</w:t>
+            </w:r>
+            <w:r>
+              <w:rPr>
+                <w:lang w:val="en-US"/>
+              </w:rPr>
+              <w:t>4</w:t>
+            </w:r>
+            <w:r>
+              <w:rPr>
+                <w:lang w:val="en-US"/>
+              </w:rPr>
+              <w:t>-</w:t>
+            </w:r>
+            <w:r>
+              <w:rPr>
+                <w:lang w:val="en-US"/>
+              </w:rPr>
+              <w:t>5</w:t>
             </w:r>
           </w:p>
         </w:tc>
@@ -629,7 +1038,25 @@
               <w:rPr>
                 <w:lang w:val="en-US"/>
               </w:rPr>
-              <w:t>Row 2</w:t>
+              <w:t>Scan</w:t>
+            </w:r>
+            <w:r>
+              <w:rPr>
+                <w:lang w:val="en-US"/>
+              </w:rPr>
+              <w:t>2</w:t>
+            </w:r>
+            <w:r>
+              <w:rPr>
+                <w:lang w:val="en-US"/>
+              </w:rPr>
+              <w:t>-</w:t>
+            </w:r>
+            <w:r>
+              <w:rPr>
+                <w:lang w:val="en-US"/>
+              </w:rPr>
+              <w:t>3</w:t>
             </w:r>
           </w:p>
         </w:tc>
@@ -688,7 +1115,25 @@
               <w:rPr>
                 <w:lang w:val="en-US"/>
               </w:rPr>
-              <w:t>Row 3</w:t>
+              <w:t>Scan</w:t>
+            </w:r>
+            <w:r>
+              <w:rPr>
+                <w:lang w:val="en-US"/>
+              </w:rPr>
+              <w:t>4</w:t>
+            </w:r>
+            <w:r>
+              <w:rPr>
+                <w:lang w:val="en-US"/>
+              </w:rPr>
+              <w:t>-</w:t>
+            </w:r>
+            <w:r>
+              <w:rPr>
+                <w:lang w:val="en-US"/>
+              </w:rPr>
+              <w:t>3</w:t>
             </w:r>
           </w:p>
         </w:tc>
@@ -718,13 +1163,13 @@
               <w:rPr>
                 <w:lang w:val="en-US"/>
               </w:rPr>
-              <w:t xml:space="preserve"> to 1</w:t>
-            </w:r>
-            <w:r>
-              <w:rPr>
-                <w:lang w:val="en-US"/>
-              </w:rPr>
-              <w:t>9</w:t>
+              <w:t xml:space="preserve"> to </w:t>
+            </w:r>
+            <w:r>
+              <w:rPr>
+                <w:lang w:val="en-US"/>
+              </w:rPr>
+              <w:t>20</w:t>
             </w:r>
           </w:p>
         </w:tc>
@@ -747,7 +1192,8 @@
               <w:rPr>
                 <w:lang w:val="en-US"/>
               </w:rPr>
-              <w:t>Row 4</w:t>
+              <w:lastRenderedPageBreak/>
+              <w:t>Scan1-2</w:t>
             </w:r>
           </w:p>
         </w:tc>
@@ -765,7 +1211,7 @@
               <w:rPr>
                 <w:lang w:val="en-US"/>
               </w:rPr>
-              <w:t>18</w:t>
+              <w:t>21</w:t>
             </w:r>
           </w:p>
         </w:tc>
@@ -785,54 +1231,1246 @@
         </w:rPr>
       </w:pPr>
     </w:p>
-    <w:p>
-      <w:pPr>
-        <w:rPr>
-          <w:lang w:val="en-US"/>
-        </w:rPr>
-      </w:pPr>
-    </w:p>
-    <w:p>
-      <w:pPr>
-        <w:rPr>
-          <w:lang w:val="en-US"/>
-        </w:rPr>
-      </w:pPr>
-    </w:p>
-    <w:p>
-      <w:pPr>
-        <w:rPr>
-          <w:lang w:val="en-US"/>
-        </w:rPr>
-      </w:pPr>
-    </w:p>
-    <w:p>
-      <w:pPr>
-        <w:rPr>
-          <w:lang w:val="en-US"/>
-        </w:rPr>
-      </w:pPr>
-    </w:p>
-    <w:p>
-      <w:pPr>
-        <w:rPr>
-          <w:lang w:val="en-US"/>
-        </w:rPr>
-      </w:pPr>
-    </w:p>
-    <w:p>
-      <w:pPr>
-        <w:rPr>
-          <w:lang w:val="en-US"/>
-        </w:rPr>
-      </w:pPr>
-    </w:p>
-    <w:p>
-      <w:pPr>
-        <w:rPr>
-          <w:lang w:val="en-US"/>
-        </w:rPr>
-      </w:pPr>
+    <w:tbl>
+      <w:tblPr>
+        <w:tblStyle w:val="TableGrid"/>
+        <w:tblW w:w="0" w:type="auto"/>
+        <w:jc w:val="center"/>
+        <w:tblLook w:val="04A0" w:firstRow="1" w:lastRow="0" w:firstColumn="1" w:lastColumn="0" w:noHBand="0" w:noVBand="1"/>
+      </w:tblPr>
+      <w:tblGrid>
+        <w:gridCol w:w="2337"/>
+        <w:gridCol w:w="3895"/>
+      </w:tblGrid>
+      <w:tr>
+        <w:trPr>
+          <w:jc w:val="center"/>
+        </w:trPr>
+        <w:tc>
+          <w:tcPr>
+            <w:tcW w:w="6232" w:type="dxa"/>
+            <w:gridSpan w:val="2"/>
+          </w:tcPr>
+          <w:p>
+            <w:pPr>
+              <w:jc w:val="center"/>
+              <w:rPr>
+                <w:lang w:val="en-US"/>
+              </w:rPr>
+            </w:pPr>
+            <w:r>
+              <w:rPr>
+                <w:lang w:val="en-US"/>
+              </w:rPr>
+              <w:t>File date: 18072025</w:t>
+            </w:r>
+          </w:p>
+        </w:tc>
+      </w:tr>
+      <w:tr>
+        <w:trPr>
+          <w:jc w:val="center"/>
+        </w:trPr>
+        <w:tc>
+          <w:tcPr>
+            <w:tcW w:w="6232" w:type="dxa"/>
+            <w:gridSpan w:val="2"/>
+          </w:tcPr>
+          <w:p>
+            <w:pPr>
+              <w:jc w:val="center"/>
+              <w:rPr>
+                <w:lang w:val="en-US"/>
+              </w:rPr>
+            </w:pPr>
+            <w:r>
+              <w:rPr>
+                <w:lang w:val="en-US"/>
+              </w:rPr>
+              <w:t>Scan 1</w:t>
+            </w:r>
+          </w:p>
+        </w:tc>
+      </w:tr>
+      <w:tr>
+        <w:trPr>
+          <w:jc w:val="center"/>
+        </w:trPr>
+        <w:tc>
+          <w:tcPr>
+            <w:tcW w:w="2337" w:type="dxa"/>
+          </w:tcPr>
+          <w:p>
+            <w:pPr>
+              <w:rPr>
+                <w:lang w:val="en-US"/>
+              </w:rPr>
+            </w:pPr>
+            <w:r>
+              <w:rPr>
+                <w:lang w:val="en-US"/>
+              </w:rPr>
+              <w:t>Scan1-2</w:t>
+            </w:r>
+          </w:p>
+        </w:tc>
+        <w:tc>
+          <w:tcPr>
+            <w:tcW w:w="3895" w:type="dxa"/>
+          </w:tcPr>
+          <w:p>
+            <w:pPr>
+              <w:rPr>
+                <w:lang w:val="en-US"/>
+              </w:rPr>
+            </w:pPr>
+            <w:r>
+              <w:rPr>
+                <w:lang w:val="en-US"/>
+              </w:rPr>
+              <w:t>1</w:t>
+            </w:r>
+          </w:p>
+        </w:tc>
+      </w:tr>
+      <w:tr>
+        <w:trPr>
+          <w:jc w:val="center"/>
+        </w:trPr>
+        <w:tc>
+          <w:tcPr>
+            <w:tcW w:w="2337" w:type="dxa"/>
+          </w:tcPr>
+          <w:p>
+            <w:pPr>
+              <w:rPr>
+                <w:lang w:val="en-US"/>
+              </w:rPr>
+            </w:pPr>
+            <w:r>
+              <w:rPr>
+                <w:lang w:val="en-US"/>
+              </w:rPr>
+              <w:t>Scan2-3</w:t>
+            </w:r>
+          </w:p>
+        </w:tc>
+        <w:tc>
+          <w:tcPr>
+            <w:tcW w:w="3895" w:type="dxa"/>
+          </w:tcPr>
+          <w:p>
+            <w:pPr>
+              <w:rPr>
+                <w:lang w:val="en-US"/>
+              </w:rPr>
+            </w:pPr>
+            <w:r>
+              <w:rPr>
+                <w:lang w:val="en-US"/>
+              </w:rPr>
+              <w:t>3</w:t>
+            </w:r>
+            <w:r>
+              <w:rPr>
+                <w:lang w:val="en-US"/>
+              </w:rPr>
+              <w:t xml:space="preserve"> to </w:t>
+            </w:r>
+            <w:r>
+              <w:rPr>
+                <w:lang w:val="en-US"/>
+              </w:rPr>
+              <w:t>7</w:t>
+            </w:r>
+          </w:p>
+        </w:tc>
+      </w:tr>
+      <w:tr>
+        <w:trPr>
+          <w:jc w:val="center"/>
+        </w:trPr>
+        <w:tc>
+          <w:tcPr>
+            <w:tcW w:w="2337" w:type="dxa"/>
+          </w:tcPr>
+          <w:p>
+            <w:pPr>
+              <w:rPr>
+                <w:lang w:val="en-US"/>
+              </w:rPr>
+            </w:pPr>
+            <w:r>
+              <w:rPr>
+                <w:lang w:val="en-US"/>
+              </w:rPr>
+              <w:t>Scan3-4</w:t>
+            </w:r>
+          </w:p>
+        </w:tc>
+        <w:tc>
+          <w:tcPr>
+            <w:tcW w:w="3895" w:type="dxa"/>
+          </w:tcPr>
+          <w:p>
+            <w:pPr>
+              <w:rPr>
+                <w:lang w:val="en-US"/>
+              </w:rPr>
+            </w:pPr>
+            <w:r>
+              <w:rPr>
+                <w:lang w:val="en-US"/>
+              </w:rPr>
+              <w:t>9</w:t>
+            </w:r>
+            <w:r>
+              <w:rPr>
+                <w:lang w:val="en-US"/>
+              </w:rPr>
+              <w:t xml:space="preserve"> to </w:t>
+            </w:r>
+            <w:r>
+              <w:rPr>
+                <w:lang w:val="en-US"/>
+              </w:rPr>
+              <w:t>1</w:t>
+            </w:r>
+            <w:r>
+              <w:rPr>
+                <w:lang w:val="en-US"/>
+              </w:rPr>
+              <w:t>3</w:t>
+            </w:r>
+          </w:p>
+        </w:tc>
+      </w:tr>
+      <w:tr>
+        <w:trPr>
+          <w:jc w:val="center"/>
+        </w:trPr>
+        <w:tc>
+          <w:tcPr>
+            <w:tcW w:w="2337" w:type="dxa"/>
+          </w:tcPr>
+          <w:p>
+            <w:pPr>
+              <w:rPr>
+                <w:lang w:val="en-US"/>
+              </w:rPr>
+            </w:pPr>
+            <w:r>
+              <w:rPr>
+                <w:lang w:val="en-US"/>
+              </w:rPr>
+              <w:t>Scan4-5</w:t>
+            </w:r>
+          </w:p>
+        </w:tc>
+        <w:tc>
+          <w:tcPr>
+            <w:tcW w:w="3895" w:type="dxa"/>
+          </w:tcPr>
+          <w:p>
+            <w:pPr>
+              <w:rPr>
+                <w:lang w:val="en-US"/>
+              </w:rPr>
+            </w:pPr>
+            <w:r>
+              <w:rPr>
+                <w:lang w:val="en-US"/>
+              </w:rPr>
+              <w:t>1</w:t>
+            </w:r>
+            <w:r>
+              <w:rPr>
+                <w:lang w:val="en-US"/>
+              </w:rPr>
+              <w:t>4</w:t>
+            </w:r>
+            <w:r>
+              <w:rPr>
+                <w:lang w:val="en-US"/>
+              </w:rPr>
+              <w:t xml:space="preserve"> to 1</w:t>
+            </w:r>
+            <w:r>
+              <w:rPr>
+                <w:lang w:val="en-US"/>
+              </w:rPr>
+              <w:t>8</w:t>
+            </w:r>
+          </w:p>
+        </w:tc>
+      </w:tr>
+      <w:tr>
+        <w:trPr>
+          <w:jc w:val="center"/>
+        </w:trPr>
+        <w:tc>
+          <w:tcPr>
+            <w:tcW w:w="2337" w:type="dxa"/>
+          </w:tcPr>
+          <w:p>
+            <w:pPr>
+              <w:rPr>
+                <w:lang w:val="en-US"/>
+              </w:rPr>
+            </w:pPr>
+            <w:r>
+              <w:rPr>
+                <w:lang w:val="en-US"/>
+              </w:rPr>
+              <w:t>Scan5</w:t>
+            </w:r>
+            <w:r>
+              <w:rPr>
+                <w:lang w:val="en-US"/>
+              </w:rPr>
+              <w:t>-6</w:t>
+            </w:r>
+          </w:p>
+        </w:tc>
+        <w:tc>
+          <w:tcPr>
+            <w:tcW w:w="3895" w:type="dxa"/>
+          </w:tcPr>
+          <w:p>
+            <w:pPr>
+              <w:rPr>
+                <w:lang w:val="en-US"/>
+              </w:rPr>
+            </w:pPr>
+            <w:r>
+              <w:rPr>
+                <w:lang w:val="en-US"/>
+              </w:rPr>
+              <w:t>20</w:t>
+            </w:r>
+            <w:r>
+              <w:rPr>
+                <w:lang w:val="en-US"/>
+              </w:rPr>
+              <w:t xml:space="preserve"> to 2</w:t>
+            </w:r>
+            <w:r>
+              <w:rPr>
+                <w:lang w:val="en-US"/>
+              </w:rPr>
+              <w:t>4</w:t>
+            </w:r>
+          </w:p>
+        </w:tc>
+      </w:tr>
+      <w:tr>
+        <w:trPr>
+          <w:jc w:val="center"/>
+        </w:trPr>
+        <w:tc>
+          <w:tcPr>
+            <w:tcW w:w="2337" w:type="dxa"/>
+          </w:tcPr>
+          <w:p>
+            <w:pPr>
+              <w:rPr>
+                <w:lang w:val="en-US"/>
+              </w:rPr>
+            </w:pPr>
+          </w:p>
+        </w:tc>
+        <w:tc>
+          <w:tcPr>
+            <w:tcW w:w="3895" w:type="dxa"/>
+          </w:tcPr>
+          <w:p>
+            <w:pPr>
+              <w:rPr>
+                <w:lang w:val="en-US"/>
+              </w:rPr>
+            </w:pPr>
+          </w:p>
+        </w:tc>
+      </w:tr>
+    </w:tbl>
+    <w:p>
+      <w:pPr>
+        <w:rPr>
+          <w:lang w:val="en-US"/>
+        </w:rPr>
+      </w:pPr>
+    </w:p>
+    <w:p>
+      <w:pPr>
+        <w:rPr>
+          <w:lang w:val="en-US"/>
+        </w:rPr>
+      </w:pPr>
+    </w:p>
+    <w:tbl>
+      <w:tblPr>
+        <w:tblStyle w:val="TableGrid"/>
+        <w:tblW w:w="0" w:type="auto"/>
+        <w:jc w:val="center"/>
+        <w:tblLook w:val="04A0" w:firstRow="1" w:lastRow="0" w:firstColumn="1" w:lastColumn="0" w:noHBand="0" w:noVBand="1"/>
+      </w:tblPr>
+      <w:tblGrid>
+        <w:gridCol w:w="2337"/>
+        <w:gridCol w:w="3895"/>
+      </w:tblGrid>
+      <w:tr>
+        <w:trPr>
+          <w:jc w:val="center"/>
+        </w:trPr>
+        <w:tc>
+          <w:tcPr>
+            <w:tcW w:w="6232" w:type="dxa"/>
+            <w:gridSpan w:val="2"/>
+          </w:tcPr>
+          <w:p>
+            <w:pPr>
+              <w:jc w:val="center"/>
+              <w:rPr>
+                <w:lang w:val="en-US"/>
+              </w:rPr>
+            </w:pPr>
+            <w:r>
+              <w:rPr>
+                <w:lang w:val="en-US"/>
+              </w:rPr>
+              <w:t xml:space="preserve">File date: </w:t>
+            </w:r>
+            <w:r>
+              <w:rPr>
+                <w:lang w:val="en-US"/>
+              </w:rPr>
+              <w:t>25</w:t>
+            </w:r>
+            <w:r>
+              <w:rPr>
+                <w:lang w:val="en-US"/>
+              </w:rPr>
+              <w:t>072025</w:t>
+            </w:r>
+          </w:p>
+        </w:tc>
+      </w:tr>
+      <w:tr>
+        <w:trPr>
+          <w:jc w:val="center"/>
+        </w:trPr>
+        <w:tc>
+          <w:tcPr>
+            <w:tcW w:w="6232" w:type="dxa"/>
+            <w:gridSpan w:val="2"/>
+          </w:tcPr>
+          <w:p>
+            <w:pPr>
+              <w:jc w:val="center"/>
+              <w:rPr>
+                <w:lang w:val="en-US"/>
+              </w:rPr>
+            </w:pPr>
+            <w:r>
+              <w:rPr>
+                <w:lang w:val="en-US"/>
+              </w:rPr>
+              <w:t>Scan 1</w:t>
+            </w:r>
+          </w:p>
+        </w:tc>
+      </w:tr>
+      <w:tr>
+        <w:trPr>
+          <w:jc w:val="center"/>
+        </w:trPr>
+        <w:tc>
+          <w:tcPr>
+            <w:tcW w:w="2337" w:type="dxa"/>
+          </w:tcPr>
+          <w:p>
+            <w:pPr>
+              <w:rPr>
+                <w:lang w:val="en-US"/>
+              </w:rPr>
+            </w:pPr>
+            <w:r>
+              <w:rPr>
+                <w:lang w:val="en-US"/>
+              </w:rPr>
+              <w:t>Scan</w:t>
+            </w:r>
+            <w:r>
+              <w:rPr>
+                <w:lang w:val="en-US"/>
+              </w:rPr>
+              <w:t xml:space="preserve"> </w:t>
+            </w:r>
+            <w:r>
+              <w:rPr>
+                <w:lang w:val="en-US"/>
+              </w:rPr>
+              <w:t>1-2</w:t>
+            </w:r>
+          </w:p>
+        </w:tc>
+        <w:tc>
+          <w:tcPr>
+            <w:tcW w:w="3895" w:type="dxa"/>
+          </w:tcPr>
+          <w:p>
+            <w:pPr>
+              <w:rPr>
+                <w:lang w:val="en-US"/>
+              </w:rPr>
+            </w:pPr>
+            <w:r>
+              <w:rPr>
+                <w:lang w:val="en-US"/>
+              </w:rPr>
+              <w:t>2</w:t>
+            </w:r>
+            <w:r>
+              <w:rPr>
+                <w:lang w:val="en-US"/>
+              </w:rPr>
+              <w:t xml:space="preserve"> to </w:t>
+            </w:r>
+            <w:r>
+              <w:rPr>
+                <w:lang w:val="en-US"/>
+              </w:rPr>
+              <w:t>4</w:t>
+            </w:r>
+          </w:p>
+        </w:tc>
+      </w:tr>
+      <w:tr>
+        <w:trPr>
+          <w:jc w:val="center"/>
+        </w:trPr>
+        <w:tc>
+          <w:tcPr>
+            <w:tcW w:w="2337" w:type="dxa"/>
+          </w:tcPr>
+          <w:p>
+            <w:pPr>
+              <w:rPr>
+                <w:lang w:val="en-US"/>
+              </w:rPr>
+            </w:pPr>
+            <w:r>
+              <w:rPr>
+                <w:lang w:val="en-US"/>
+              </w:rPr>
+              <w:t>Scan</w:t>
+            </w:r>
+            <w:r>
+              <w:rPr>
+                <w:lang w:val="en-US"/>
+              </w:rPr>
+              <w:t xml:space="preserve"> </w:t>
+            </w:r>
+            <w:r>
+              <w:rPr>
+                <w:lang w:val="en-US"/>
+              </w:rPr>
+              <w:t>2-3</w:t>
+            </w:r>
+          </w:p>
+        </w:tc>
+        <w:tc>
+          <w:tcPr>
+            <w:tcW w:w="3895" w:type="dxa"/>
+          </w:tcPr>
+          <w:p>
+            <w:pPr>
+              <w:rPr>
+                <w:lang w:val="en-US"/>
+              </w:rPr>
+            </w:pPr>
+            <w:r>
+              <w:rPr>
+                <w:lang w:val="en-US"/>
+              </w:rPr>
+              <w:t>4 to 6</w:t>
+            </w:r>
+          </w:p>
+        </w:tc>
+      </w:tr>
+      <w:tr>
+        <w:trPr>
+          <w:jc w:val="center"/>
+        </w:trPr>
+        <w:tc>
+          <w:tcPr>
+            <w:tcW w:w="2337" w:type="dxa"/>
+          </w:tcPr>
+          <w:p>
+            <w:pPr>
+              <w:rPr>
+                <w:lang w:val="en-US"/>
+              </w:rPr>
+            </w:pPr>
+            <w:r>
+              <w:rPr>
+                <w:lang w:val="en-US"/>
+              </w:rPr>
+              <w:t>Scan</w:t>
+            </w:r>
+            <w:r>
+              <w:rPr>
+                <w:lang w:val="en-US"/>
+              </w:rPr>
+              <w:t xml:space="preserve"> </w:t>
+            </w:r>
+            <w:r>
+              <w:rPr>
+                <w:lang w:val="en-US"/>
+              </w:rPr>
+              <w:t>3-4</w:t>
+            </w:r>
+          </w:p>
+        </w:tc>
+        <w:tc>
+          <w:tcPr>
+            <w:tcW w:w="3895" w:type="dxa"/>
+          </w:tcPr>
+          <w:p>
+            <w:pPr>
+              <w:rPr>
+                <w:lang w:val="en-US"/>
+              </w:rPr>
+            </w:pPr>
+            <w:r>
+              <w:rPr>
+                <w:lang w:val="en-US"/>
+              </w:rPr>
+              <w:t>7 to 9</w:t>
+            </w:r>
+          </w:p>
+        </w:tc>
+      </w:tr>
+      <w:tr>
+        <w:trPr>
+          <w:jc w:val="center"/>
+        </w:trPr>
+        <w:tc>
+          <w:tcPr>
+            <w:tcW w:w="2337" w:type="dxa"/>
+          </w:tcPr>
+          <w:p>
+            <w:pPr>
+              <w:rPr>
+                <w:lang w:val="en-US"/>
+              </w:rPr>
+            </w:pPr>
+            <w:r>
+              <w:rPr>
+                <w:lang w:val="en-US"/>
+              </w:rPr>
+              <w:t>Scan</w:t>
+            </w:r>
+            <w:r>
+              <w:rPr>
+                <w:lang w:val="en-US"/>
+              </w:rPr>
+              <w:t xml:space="preserve"> </w:t>
+            </w:r>
+            <w:r>
+              <w:rPr>
+                <w:lang w:val="en-US"/>
+              </w:rPr>
+              <w:t>4-5</w:t>
+            </w:r>
+          </w:p>
+        </w:tc>
+        <w:tc>
+          <w:tcPr>
+            <w:tcW w:w="3895" w:type="dxa"/>
+          </w:tcPr>
+          <w:p>
+            <w:pPr>
+              <w:rPr>
+                <w:lang w:val="en-US"/>
+              </w:rPr>
+            </w:pPr>
+            <w:r>
+              <w:rPr>
+                <w:lang w:val="en-US"/>
+              </w:rPr>
+              <w:t>11</w:t>
+            </w:r>
+            <w:r>
+              <w:rPr>
+                <w:lang w:val="en-US"/>
+              </w:rPr>
+              <w:t xml:space="preserve"> to 13</w:t>
+            </w:r>
+          </w:p>
+        </w:tc>
+      </w:tr>
+      <w:tr>
+        <w:trPr>
+          <w:jc w:val="center"/>
+        </w:trPr>
+        <w:tc>
+          <w:tcPr>
+            <w:tcW w:w="2337" w:type="dxa"/>
+          </w:tcPr>
+          <w:p>
+            <w:pPr>
+              <w:rPr>
+                <w:lang w:val="en-US"/>
+              </w:rPr>
+            </w:pPr>
+            <w:r>
+              <w:rPr>
+                <w:lang w:val="en-US"/>
+              </w:rPr>
+              <w:t>Scan</w:t>
+            </w:r>
+            <w:r>
+              <w:rPr>
+                <w:lang w:val="en-US"/>
+              </w:rPr>
+              <w:t xml:space="preserve"> </w:t>
+            </w:r>
+            <w:r>
+              <w:rPr>
+                <w:lang w:val="en-US"/>
+              </w:rPr>
+              <w:t>5-6</w:t>
+            </w:r>
+          </w:p>
+        </w:tc>
+        <w:tc>
+          <w:tcPr>
+            <w:tcW w:w="3895" w:type="dxa"/>
+          </w:tcPr>
+          <w:p>
+            <w:pPr>
+              <w:rPr>
+                <w:lang w:val="en-US"/>
+              </w:rPr>
+            </w:pPr>
+            <w:r>
+              <w:rPr>
+                <w:lang w:val="en-US"/>
+              </w:rPr>
+              <w:t>14 to 16</w:t>
+            </w:r>
+          </w:p>
+        </w:tc>
+      </w:tr>
+      <w:tr>
+        <w:trPr>
+          <w:jc w:val="center"/>
+        </w:trPr>
+        <w:tc>
+          <w:tcPr>
+            <w:tcW w:w="2337" w:type="dxa"/>
+          </w:tcPr>
+          <w:p>
+            <w:pPr>
+              <w:rPr>
+                <w:lang w:val="en-US"/>
+              </w:rPr>
+            </w:pPr>
+            <w:r>
+              <w:rPr>
+                <w:lang w:val="en-US"/>
+              </w:rPr>
+              <w:t xml:space="preserve">Scan </w:t>
+            </w:r>
+            <w:r>
+              <w:rPr>
+                <w:lang w:val="en-US"/>
+              </w:rPr>
+              <w:t>6-7</w:t>
+            </w:r>
+          </w:p>
+        </w:tc>
+        <w:tc>
+          <w:tcPr>
+            <w:tcW w:w="3895" w:type="dxa"/>
+          </w:tcPr>
+          <w:p>
+            <w:pPr>
+              <w:rPr>
+                <w:lang w:val="en-US"/>
+              </w:rPr>
+            </w:pPr>
+            <w:r>
+              <w:rPr>
+                <w:lang w:val="en-US"/>
+              </w:rPr>
+              <w:t>17 to 19</w:t>
+            </w:r>
+          </w:p>
+        </w:tc>
+      </w:tr>
+      <w:tr>
+        <w:trPr>
+          <w:jc w:val="center"/>
+        </w:trPr>
+        <w:tc>
+          <w:tcPr>
+            <w:tcW w:w="6232" w:type="dxa"/>
+            <w:gridSpan w:val="2"/>
+          </w:tcPr>
+          <w:p>
+            <w:pPr>
+              <w:jc w:val="center"/>
+              <w:rPr>
+                <w:lang w:val="en-US"/>
+              </w:rPr>
+            </w:pPr>
+            <w:r>
+              <w:rPr>
+                <w:lang w:val="en-US"/>
+              </w:rPr>
+              <w:t>Scan 2</w:t>
+            </w:r>
+          </w:p>
+        </w:tc>
+      </w:tr>
+      <w:tr>
+        <w:trPr>
+          <w:jc w:val="center"/>
+        </w:trPr>
+        <w:tc>
+          <w:tcPr>
+            <w:tcW w:w="2337" w:type="dxa"/>
+          </w:tcPr>
+          <w:p>
+            <w:pPr>
+              <w:rPr>
+                <w:lang w:val="en-US"/>
+              </w:rPr>
+            </w:pPr>
+            <w:r>
+              <w:rPr>
+                <w:lang w:val="en-US"/>
+              </w:rPr>
+              <w:t>Scan</w:t>
+            </w:r>
+            <w:r>
+              <w:rPr>
+                <w:lang w:val="en-US"/>
+              </w:rPr>
+              <w:t xml:space="preserve"> 1 to 2</w:t>
+            </w:r>
+          </w:p>
+        </w:tc>
+        <w:tc>
+          <w:tcPr>
+            <w:tcW w:w="3895" w:type="dxa"/>
+          </w:tcPr>
+          <w:p>
+            <w:pPr>
+              <w:rPr>
+                <w:lang w:val="en-US"/>
+              </w:rPr>
+            </w:pPr>
+            <w:r>
+              <w:rPr>
+                <w:lang w:val="en-US"/>
+              </w:rPr>
+              <w:t>21</w:t>
+            </w:r>
+            <w:r>
+              <w:rPr>
+                <w:lang w:val="en-US"/>
+              </w:rPr>
+              <w:t xml:space="preserve"> to </w:t>
+            </w:r>
+            <w:r>
+              <w:rPr>
+                <w:lang w:val="en-US"/>
+              </w:rPr>
+              <w:t>23</w:t>
+            </w:r>
+          </w:p>
+        </w:tc>
+      </w:tr>
+    </w:tbl>
+    <w:p>
+      <w:pPr>
+        <w:rPr>
+          <w:lang w:val="en-US"/>
+        </w:rPr>
+      </w:pPr>
+    </w:p>
+    <w:p>
+      <w:pPr>
+        <w:rPr>
+          <w:lang w:val="en-US"/>
+        </w:rPr>
+      </w:pPr>
+    </w:p>
+    <w:tbl>
+      <w:tblPr>
+        <w:tblStyle w:val="TableGrid"/>
+        <w:tblW w:w="0" w:type="auto"/>
+        <w:jc w:val="center"/>
+        <w:tblLook w:val="04A0" w:firstRow="1" w:lastRow="0" w:firstColumn="1" w:lastColumn="0" w:noHBand="0" w:noVBand="1"/>
+      </w:tblPr>
+      <w:tblGrid>
+        <w:gridCol w:w="2337"/>
+        <w:gridCol w:w="3895"/>
+      </w:tblGrid>
+      <w:tr>
+        <w:trPr>
+          <w:jc w:val="center"/>
+        </w:trPr>
+        <w:tc>
+          <w:tcPr>
+            <w:tcW w:w="6232" w:type="dxa"/>
+            <w:gridSpan w:val="2"/>
+          </w:tcPr>
+          <w:p>
+            <w:pPr>
+              <w:jc w:val="center"/>
+              <w:rPr>
+                <w:lang w:val="en-US"/>
+              </w:rPr>
+            </w:pPr>
+            <w:r>
+              <w:rPr>
+                <w:lang w:val="en-US"/>
+              </w:rPr>
+              <w:t>File date: 30072025</w:t>
+            </w:r>
+          </w:p>
+        </w:tc>
+      </w:tr>
+      <w:tr>
+        <w:trPr>
+          <w:jc w:val="center"/>
+        </w:trPr>
+        <w:tc>
+          <w:tcPr>
+            <w:tcW w:w="6232" w:type="dxa"/>
+            <w:gridSpan w:val="2"/>
+          </w:tcPr>
+          <w:p>
+            <w:pPr>
+              <w:jc w:val="center"/>
+              <w:rPr>
+                <w:lang w:val="en-US"/>
+              </w:rPr>
+            </w:pPr>
+            <w:r>
+              <w:rPr>
+                <w:lang w:val="en-US"/>
+              </w:rPr>
+              <w:t>Scan 1</w:t>
+            </w:r>
+          </w:p>
+        </w:tc>
+      </w:tr>
+      <w:tr>
+        <w:trPr>
+          <w:jc w:val="center"/>
+        </w:trPr>
+        <w:tc>
+          <w:tcPr>
+            <w:tcW w:w="2337" w:type="dxa"/>
+          </w:tcPr>
+          <w:p>
+            <w:pPr>
+              <w:rPr>
+                <w:lang w:val="en-US"/>
+              </w:rPr>
+            </w:pPr>
+            <w:r>
+              <w:rPr>
+                <w:lang w:val="en-US"/>
+              </w:rPr>
+              <w:t>Scan</w:t>
+            </w:r>
+            <w:r>
+              <w:rPr>
+                <w:lang w:val="en-US"/>
+              </w:rPr>
+              <w:t xml:space="preserve"> 2</w:t>
+            </w:r>
+            <w:r>
+              <w:rPr>
+                <w:lang w:val="en-US"/>
+              </w:rPr>
+              <w:t>-</w:t>
+            </w:r>
+            <w:r>
+              <w:rPr>
+                <w:lang w:val="en-US"/>
+              </w:rPr>
+              <w:t>3</w:t>
+            </w:r>
+          </w:p>
+        </w:tc>
+        <w:tc>
+          <w:tcPr>
+            <w:tcW w:w="3895" w:type="dxa"/>
+          </w:tcPr>
+          <w:p>
+            <w:pPr>
+              <w:rPr>
+                <w:lang w:val="en-US"/>
+              </w:rPr>
+            </w:pPr>
+            <w:r>
+              <w:rPr>
+                <w:lang w:val="en-US"/>
+              </w:rPr>
+              <w:t>1</w:t>
+            </w:r>
+          </w:p>
+        </w:tc>
+      </w:tr>
+      <w:tr>
+        <w:trPr>
+          <w:jc w:val="center"/>
+        </w:trPr>
+        <w:tc>
+          <w:tcPr>
+            <w:tcW w:w="2337" w:type="dxa"/>
+          </w:tcPr>
+          <w:p>
+            <w:pPr>
+              <w:rPr>
+                <w:lang w:val="en-US"/>
+              </w:rPr>
+            </w:pPr>
+            <w:r>
+              <w:rPr>
+                <w:lang w:val="en-US"/>
+              </w:rPr>
+              <w:t>Scan</w:t>
+            </w:r>
+            <w:r>
+              <w:rPr>
+                <w:lang w:val="en-US"/>
+              </w:rPr>
+              <w:t xml:space="preserve"> </w:t>
+            </w:r>
+            <w:r>
+              <w:rPr>
+                <w:lang w:val="en-US"/>
+              </w:rPr>
+              <w:t>3</w:t>
+            </w:r>
+            <w:r>
+              <w:rPr>
+                <w:lang w:val="en-US"/>
+              </w:rPr>
+              <w:t>-</w:t>
+            </w:r>
+            <w:r>
+              <w:rPr>
+                <w:lang w:val="en-US"/>
+              </w:rPr>
+              <w:t>4</w:t>
+            </w:r>
+          </w:p>
+        </w:tc>
+        <w:tc>
+          <w:tcPr>
+            <w:tcW w:w="3895" w:type="dxa"/>
+          </w:tcPr>
+          <w:p>
+            <w:pPr>
+              <w:rPr>
+                <w:lang w:val="en-US"/>
+              </w:rPr>
+            </w:pPr>
+            <w:r>
+              <w:rPr>
+                <w:lang w:val="en-US"/>
+              </w:rPr>
+              <w:t>10</w:t>
+            </w:r>
+            <w:r>
+              <w:rPr>
+                <w:lang w:val="en-US"/>
+              </w:rPr>
+              <w:t xml:space="preserve"> to </w:t>
+            </w:r>
+            <w:r>
+              <w:rPr>
+                <w:lang w:val="en-US"/>
+              </w:rPr>
+              <w:t>12</w:t>
+            </w:r>
+          </w:p>
+        </w:tc>
+      </w:tr>
+      <w:tr>
+        <w:trPr>
+          <w:jc w:val="center"/>
+        </w:trPr>
+        <w:tc>
+          <w:tcPr>
+            <w:tcW w:w="2337" w:type="dxa"/>
+          </w:tcPr>
+          <w:p>
+            <w:pPr>
+              <w:rPr>
+                <w:lang w:val="en-US"/>
+              </w:rPr>
+            </w:pPr>
+            <w:r>
+              <w:rPr>
+                <w:lang w:val="en-US"/>
+              </w:rPr>
+              <w:t>Scan</w:t>
+            </w:r>
+            <w:r>
+              <w:rPr>
+                <w:lang w:val="en-US"/>
+              </w:rPr>
+              <w:t xml:space="preserve"> </w:t>
+            </w:r>
+            <w:r>
+              <w:rPr>
+                <w:lang w:val="en-US"/>
+              </w:rPr>
+              <w:t>4</w:t>
+            </w:r>
+            <w:r>
+              <w:rPr>
+                <w:lang w:val="en-US"/>
+              </w:rPr>
+              <w:t>-5</w:t>
+            </w:r>
+          </w:p>
+        </w:tc>
+        <w:tc>
+          <w:tcPr>
+            <w:tcW w:w="3895" w:type="dxa"/>
+          </w:tcPr>
+          <w:p>
+            <w:pPr>
+              <w:rPr>
+                <w:lang w:val="en-US"/>
+              </w:rPr>
+            </w:pPr>
+            <w:r>
+              <w:rPr>
+                <w:lang w:val="en-US"/>
+              </w:rPr>
+              <w:t>14</w:t>
+            </w:r>
+            <w:r>
+              <w:rPr>
+                <w:lang w:val="en-US"/>
+              </w:rPr>
+              <w:t xml:space="preserve"> to 1</w:t>
+            </w:r>
+            <w:r>
+              <w:rPr>
+                <w:lang w:val="en-US"/>
+              </w:rPr>
+              <w:t>5</w:t>
+            </w:r>
+          </w:p>
+        </w:tc>
+      </w:tr>
+    </w:tbl>
+    <w:p>
+      <w:pPr>
+        <w:rPr>
+          <w:lang w:val="en-US"/>
+        </w:rPr>
+      </w:pPr>
+    </w:p>
+    <w:p>
+      <w:pPr>
+        <w:rPr>
+          <w:lang w:val="en-US"/>
+        </w:rPr>
+      </w:pPr>
+    </w:p>
+    <w:p>
+      <w:pPr>
+        <w:rPr>
+          <w:lang w:val="en-US"/>
+        </w:rPr>
+      </w:pPr>
+    </w:p>
+    <w:p>
+      <w:pPr>
+        <w:rPr>
+          <w:b/>
+          <w:bCs/>
+          <w:lang w:val="en-US"/>
+        </w:rPr>
+      </w:pPr>
+      <w:r>
+        <w:rPr>
+          <w:b/>
+          <w:bCs/>
+          <w:lang w:val="en-US"/>
+        </w:rPr>
+        <w:t xml:space="preserve">Combine cube </w:t>
+      </w:r>
+    </w:p>
+    <w:p>
+      <w:pPr>
+        <w:rPr>
+          <w:lang w:val="en-US"/>
+        </w:rPr>
+      </w:pPr>
+      <w:r>
+        <w:rPr>
+          <w:lang w:val="en-US"/>
+        </w:rPr>
+        <w:tab/>
+      </w:r>
+      <w:proofErr w:type="gramStart"/>
+      <w:r>
+        <w:rPr>
+          <w:lang w:val="en-US"/>
+        </w:rPr>
+        <w:t>Combine</w:t>
+      </w:r>
+      <w:proofErr w:type="gramEnd"/>
+      <w:r>
+        <w:rPr>
+          <w:lang w:val="en-US"/>
+        </w:rPr>
+        <w:t xml:space="preserve"> </w:t>
+      </w:r>
+      <w:proofErr w:type="gramStart"/>
+      <w:r>
+        <w:rPr>
+          <w:lang w:val="en-US"/>
+        </w:rPr>
+        <w:t>cube</w:t>
+      </w:r>
+      <w:proofErr w:type="gramEnd"/>
+      <w:r>
+        <w:rPr>
+          <w:lang w:val="en-US"/>
+        </w:rPr>
+        <w:t xml:space="preserve"> will give synch GPS time with HSI System time</w:t>
+      </w:r>
+    </w:p>
+    <w:p>
+      <w:pPr>
+        <w:rPr>
+          <w:lang w:val="en-US"/>
+        </w:rPr>
+      </w:pPr>
+      <w:r>
+        <w:rPr>
+          <w:lang w:val="en-US"/>
+        </w:rPr>
+        <w:lastRenderedPageBreak/>
+        <w:tab/>
+        <w:t xml:space="preserve"> </w:t>
+      </w:r>
     </w:p>
     <w:p>
       <w:pPr>
@@ -980,12 +2618,14 @@
           <w:lang w:val="en-US"/>
         </w:rPr>
       </w:pPr>
+      <w:bookmarkStart w:id="2" w:name="_Toc223906798"/>
       <w:r>
         <w:rPr>
           <w:lang w:val="en-US"/>
         </w:rPr>
         <w:t>UAV_Navigation.py</w:t>
       </w:r>
+      <w:bookmarkEnd w:id="2"/>
     </w:p>
     <w:p>
       <w:pPr>
@@ -1056,6 +2696,7 @@
           <w:lang w:val="en-US"/>
         </w:rPr>
       </w:pPr>
+      <w:bookmarkStart w:id="3" w:name="_Toc223906799"/>
       <w:r>
         <w:rPr>
           <w:lang w:val="en-US"/>
@@ -1063,6 +2704,7 @@
         <w:lastRenderedPageBreak/>
         <w:t>Other data</w:t>
       </w:r>
+      <w:bookmarkEnd w:id="3"/>
     </w:p>
     <w:p>
       <w:pPr>
@@ -1518,6 +3160,7 @@
             <w:hideMark/>
           </w:tcPr>
           <w:p>
+            <w:proofErr w:type="spellStart"/>
             <w:r>
               <w:rPr>
                 <w:b/>
@@ -1525,6 +3168,7 @@
               </w:rPr>
               <w:t>vel_east</w:t>
             </w:r>
+            <w:proofErr w:type="spellEnd"/>
           </w:p>
         </w:tc>
         <w:tc>
@@ -1563,6 +3207,7 @@
             <w:hideMark/>
           </w:tcPr>
           <w:p>
+            <w:proofErr w:type="spellStart"/>
             <w:r>
               <w:rPr>
                 <w:b/>
@@ -1570,6 +3215,7 @@
               </w:rPr>
               <w:t>vel_north</w:t>
             </w:r>
+            <w:proofErr w:type="spellEnd"/>
           </w:p>
         </w:tc>
         <w:tc>
@@ -1653,6 +3299,7 @@
             <w:hideMark/>
           </w:tcPr>
           <w:p>
+            <w:proofErr w:type="spellStart"/>
             <w:r>
               <w:rPr>
                 <w:b/>
@@ -1660,6 +3307,7 @@
               </w:rPr>
               <w:t>nav_status</w:t>
             </w:r>
+            <w:proofErr w:type="spellEnd"/>
           </w:p>
         </w:tc>
         <w:tc>
@@ -1743,12 +3391,21 @@
             <w:hideMark/>
           </w:tcPr>
           <w:p>
+            <w:proofErr w:type="spellStart"/>
             <w:r>
               <w:rPr>
                 <w:b/>
                 <w:bCs/>
               </w:rPr>
-              <w:t>frame_index / scanline id</w:t>
+              <w:t>frame_index</w:t>
+            </w:r>
+            <w:proofErr w:type="spellEnd"/>
+            <w:r>
+              <w:rPr>
+                <w:b/>
+                <w:bCs/>
+              </w:rPr>
+              <w:t xml:space="preserve"> / scanline id</w:t>
             </w:r>
           </w:p>
         </w:tc>
@@ -2401,6 +4058,7 @@
   <w:style w:type="paragraph" w:default="1" w:styleId="Normal">
     <w:name w:val="Normal"/>
     <w:qFormat/>
+    <w:rsid w:val="00F2732F"/>
   </w:style>
   <w:style w:type="paragraph" w:styleId="Heading1">
     <w:name w:val="heading 1"/>
@@ -2935,6 +4593,62 @@
       </w:tblBorders>
     </w:tblPr>
   </w:style>
+  <w:style w:type="paragraph" w:styleId="TOCHeading">
+    <w:name w:val="TOC Heading"/>
+    <w:basedOn w:val="Heading1"/>
+    <w:next w:val="Normal"/>
+    <w:uiPriority w:val="39"/>
+    <w:unhideWhenUsed/>
+    <w:qFormat/>
+    <w:rsid w:val="00385C84"/>
+    <w:pPr>
+      <w:spacing w:before="240" w:after="0" w:line="259" w:lineRule="auto"/>
+      <w:outlineLvl w:val="9"/>
+    </w:pPr>
+    <w:rPr>
+      <w:kern w:val="0"/>
+      <w:sz w:val="32"/>
+      <w:szCs w:val="32"/>
+      <w:lang w:val="en-US"/>
+      <w14:ligatures w14:val="none"/>
+    </w:rPr>
+  </w:style>
+  <w:style w:type="paragraph" w:styleId="TOC1">
+    <w:name w:val="toc 1"/>
+    <w:basedOn w:val="Normal"/>
+    <w:next w:val="Normal"/>
+    <w:autoRedefine/>
+    <w:uiPriority w:val="39"/>
+    <w:unhideWhenUsed/>
+    <w:rsid w:val="00385C84"/>
+    <w:pPr>
+      <w:spacing w:after="100"/>
+    </w:pPr>
+  </w:style>
+  <w:style w:type="paragraph" w:styleId="TOC2">
+    <w:name w:val="toc 2"/>
+    <w:basedOn w:val="Normal"/>
+    <w:next w:val="Normal"/>
+    <w:autoRedefine/>
+    <w:uiPriority w:val="39"/>
+    <w:unhideWhenUsed/>
+    <w:rsid w:val="00385C84"/>
+    <w:pPr>
+      <w:spacing w:after="100"/>
+      <w:ind w:left="240"/>
+    </w:pPr>
+  </w:style>
+  <w:style w:type="character" w:styleId="Hyperlink">
+    <w:name w:val="Hyperlink"/>
+    <w:basedOn w:val="DefaultParagraphFont"/>
+    <w:uiPriority w:val="99"/>
+    <w:unhideWhenUsed/>
+    <w:rsid w:val="00385C84"/>
+    <w:rPr>
+      <w:color w:val="467886" w:themeColor="hyperlink"/>
+      <w:u w:val="single"/>
+    </w:rPr>
+  </w:style>
 </w:styles>
 </file>
 
@@ -3231,4 +4945,16 @@
     </a:ext>
   </a:extLst>
 </a:theme>
+</file>
+
+<file path=customXml/item1.xml><?xml version="1.0" encoding="utf-8"?>
+<b:Sources xmlns:b="http://schemas.openxmlformats.org/officeDocument/2006/bibliography" xmlns="http://schemas.openxmlformats.org/officeDocument/2006/bibliography" SelectedStyle="\APASixthEditionOfficeOnline.xsl" StyleName="APA" Version="6"/>
+</file>
+
+<file path=customXml/itemProps1.xml><?xml version="1.0" encoding="utf-8"?>
+<ds:datastoreItem xmlns:ds="http://schemas.openxmlformats.org/officeDocument/2006/customXml" ds:itemID="{1D060A5D-4BC2-4DC7-881D-3AA93585DA16}">
+  <ds:schemaRefs>
+    <ds:schemaRef ds:uri="http://schemas.openxmlformats.org/officeDocument/2006/bibliography"/>
+  </ds:schemaRefs>
+</ds:datastoreItem>
 </file>
</xml_diff>